<commit_message>
feat(template): add objectives and time allocation table to program template
</commit_message>
<xml_diff>
--- a/public/templates/chuong_trinh_mon_hoc_mau.docx
+++ b/public/templates/chuong_trinh_mon_hoc_mau.docx
@@ -4,18 +4,25 @@
   <w:body>
     <w:p>
       <w:pPr>
-        <w:pStyle w:val="Heading1"/>
+        <w:spacing w:after="200"/>
         <w:jc w:val="center"/>
       </w:pPr>
       <w:r>
+        <w:rPr>
+          <w:b/>
+          <w:bCs/>
+          <w:sz w:val="28"/>
+          <w:szCs w:val="28"/>
+        </w:rPr>
         <w:t xml:space="preserve">CHƯƠNG TRÌNH MÔN HỌC</w:t>
       </w:r>
     </w:p>
     <w:p>
-      <w:pPr>
-        <w:pStyle w:val="Heading2"/>
-      </w:pPr>
-      <w:r>
+      <w:r>
+        <w:rPr>
+          <w:b/>
+          <w:bCs/>
+        </w:rPr>
         <w:t xml:space="preserve">Tên môn học: MÔN HỌC MẪU</w:t>
       </w:r>
     </w:p>
@@ -30,33 +37,409 @@
       </w:r>
     </w:p>
     <w:p>
-      <w:r>
-        <w:t xml:space="preserve"> </w:t>
-      </w:r>
-    </w:p>
-    <w:p>
-      <w:pPr>
-        <w:pStyle w:val="Heading3"/>
-      </w:pPr>
-      <w:r>
-        <w:t xml:space="preserve">CHƯƠNG TRÌNH CHI TIẾT:</w:t>
-      </w:r>
-    </w:p>
-    <w:p>
-      <w:pPr>
-        <w:pStyle w:val="Heading4"/>
-      </w:pPr>
-      <w:r>
+      <w:pPr>
+        <w:spacing w:after="200"/>
+      </w:pPr>
+    </w:p>
+    <w:p>
+      <w:pPr>
+        <w:spacing w:after="120"/>
+      </w:pPr>
+      <w:r>
+        <w:rPr>
+          <w:b/>
+          <w:bCs/>
+        </w:rPr>
+        <w:t xml:space="preserve">1. Nội dung tổng quát và phân bổ thời gian</w:t>
+      </w:r>
+    </w:p>
+    <w:tbl>
+      <w:tblPr>
+        <w:tblW w:type="pct" w:w="100%"/>
+        <w:tblBorders>
+          <w:top w:val="single" w:color="000000" w:sz="1"/>
+          <w:left w:val="single" w:color="000000" w:sz="1"/>
+          <w:bottom w:val="single" w:color="000000" w:sz="1"/>
+          <w:right w:val="single" w:color="000000" w:sz="1"/>
+          <w:insideH w:val="single" w:color="000000" w:sz="1"/>
+          <w:insideV w:val="single" w:color="000000" w:sz="1"/>
+        </w:tblBorders>
+      </w:tblPr>
+      <w:tblGrid>
+        <w:gridCol w:w="100"/>
+        <w:gridCol w:w="100"/>
+        <w:gridCol w:w="100"/>
+        <w:gridCol w:w="100"/>
+        <w:gridCol w:w="100"/>
+        <w:gridCol w:w="100"/>
+      </w:tblGrid>
+      <w:tr>
+        <w:tc>
+          <w:tcPr>
+            <w:vAlign w:val="center"/>
+          </w:tcPr>
+          <w:p>
+            <w:pPr>
+              <w:jc w:val="center"/>
+            </w:pPr>
+            <w:r>
+              <w:rPr>
+                <w:b/>
+                <w:bCs/>
+              </w:rPr>
+              <w:t xml:space="preserve">Số TT</w:t>
+            </w:r>
+          </w:p>
+        </w:tc>
+        <w:tc>
+          <w:tcPr>
+            <w:vAlign w:val="center"/>
+          </w:tcPr>
+          <w:p>
+            <w:pPr>
+              <w:jc w:val="center"/>
+            </w:pPr>
+            <w:r>
+              <w:rPr>
+                <w:b/>
+                <w:bCs/>
+              </w:rPr>
+              <w:t xml:space="preserve">Tên chương, mục</w:t>
+            </w:r>
+          </w:p>
+        </w:tc>
+        <w:tc>
+          <w:tcPr>
+            <w:vAlign w:val="center"/>
+          </w:tcPr>
+          <w:p>
+            <w:pPr>
+              <w:jc w:val="center"/>
+            </w:pPr>
+            <w:r>
+              <w:rPr>
+                <w:b/>
+                <w:bCs/>
+              </w:rPr>
+              <w:t xml:space="preserve">Tổng số</w:t>
+            </w:r>
+          </w:p>
+        </w:tc>
+        <w:tc>
+          <w:tcPr>
+            <w:vAlign w:val="center"/>
+          </w:tcPr>
+          <w:p>
+            <w:pPr>
+              <w:jc w:val="center"/>
+            </w:pPr>
+            <w:r>
+              <w:rPr>
+                <w:b/>
+                <w:bCs/>
+              </w:rPr>
+              <w:t xml:space="preserve">Lý thuyết</w:t>
+            </w:r>
+          </w:p>
+        </w:tc>
+        <w:tc>
+          <w:tcPr>
+            <w:vAlign w:val="center"/>
+          </w:tcPr>
+          <w:p>
+            <w:pPr>
+              <w:jc w:val="center"/>
+            </w:pPr>
+            <w:r>
+              <w:rPr>
+                <w:b/>
+                <w:bCs/>
+              </w:rPr>
+              <w:t xml:space="preserve">Thực hành</w:t>
+            </w:r>
+          </w:p>
+        </w:tc>
+        <w:tc>
+          <w:tcPr>
+            <w:vAlign w:val="center"/>
+          </w:tcPr>
+          <w:p>
+            <w:pPr>
+              <w:jc w:val="center"/>
+            </w:pPr>
+            <w:r>
+              <w:rPr>
+                <w:b/>
+                <w:bCs/>
+              </w:rPr>
+              <w:t xml:space="preserve">Kiểm tra</w:t>
+            </w:r>
+          </w:p>
+        </w:tc>
+      </w:tr>
+      <w:tr>
+        <w:tc>
+          <w:p>
+            <w:pPr>
+              <w:jc w:val="center"/>
+            </w:pPr>
+            <w:r>
+              <w:t xml:space="preserve">1</w:t>
+            </w:r>
+          </w:p>
+        </w:tc>
+        <w:tc>
+          <w:p>
+            <w:r>
+              <w:t xml:space="preserve">Bài 1: Khái niệm cơ bản</w:t>
+            </w:r>
+          </w:p>
+        </w:tc>
+        <w:tc>
+          <w:p>
+            <w:pPr>
+              <w:jc w:val="center"/>
+            </w:pPr>
+            <w:r>
+              <w:t xml:space="preserve">5</w:t>
+            </w:r>
+          </w:p>
+        </w:tc>
+        <w:tc>
+          <w:p>
+            <w:pPr>
+              <w:jc w:val="center"/>
+            </w:pPr>
+            <w:r>
+              <w:t xml:space="preserve">3</w:t>
+            </w:r>
+          </w:p>
+        </w:tc>
+        <w:tc>
+          <w:p>
+            <w:pPr>
+              <w:jc w:val="center"/>
+            </w:pPr>
+            <w:r>
+              <w:t xml:space="preserve">2</w:t>
+            </w:r>
+          </w:p>
+        </w:tc>
+        <w:tc>
+          <w:p>
+            <w:pPr>
+              <w:jc w:val="center"/>
+            </w:pPr>
+            <w:r>
+              <w:t xml:space="preserve">0</w:t>
+            </w:r>
+          </w:p>
+        </w:tc>
+      </w:tr>
+      <w:tr>
+        <w:tc>
+          <w:p>
+            <w:pPr>
+              <w:jc w:val="center"/>
+            </w:pPr>
+            <w:r>
+              <w:t xml:space="preserve">2</w:t>
+            </w:r>
+          </w:p>
+        </w:tc>
+        <w:tc>
+          <w:p>
+            <w:r>
+              <w:t xml:space="preserve">Bài 2: Kỹ năng nâng cao</w:t>
+            </w:r>
+          </w:p>
+        </w:tc>
+        <w:tc>
+          <w:p>
+            <w:pPr>
+              <w:jc w:val="center"/>
+            </w:pPr>
+            <w:r>
+              <w:t xml:space="preserve">7</w:t>
+            </w:r>
+          </w:p>
+        </w:tc>
+        <w:tc>
+          <w:p>
+            <w:pPr>
+              <w:jc w:val="center"/>
+            </w:pPr>
+            <w:r>
+              <w:t xml:space="preserve">3</w:t>
+            </w:r>
+          </w:p>
+        </w:tc>
+        <w:tc>
+          <w:p>
+            <w:pPr>
+              <w:jc w:val="center"/>
+            </w:pPr>
+            <w:r>
+              <w:t xml:space="preserve">4</w:t>
+            </w:r>
+          </w:p>
+        </w:tc>
+        <w:tc>
+          <w:p>
+            <w:pPr>
+              <w:jc w:val="center"/>
+            </w:pPr>
+            <w:r>
+              <w:t xml:space="preserve">0</w:t>
+            </w:r>
+          </w:p>
+        </w:tc>
+      </w:tr>
+      <w:tr>
+        <w:tc>
+          <w:p>
+            <w:r>
+              <w:t xml:space="preserve"/>
+            </w:r>
+          </w:p>
+        </w:tc>
+        <w:tc>
+          <w:p>
+            <w:pPr>
+              <w:jc w:val="center"/>
+            </w:pPr>
+            <w:r>
+              <w:rPr>
+                <w:b/>
+                <w:bCs/>
+              </w:rPr>
+              <w:t xml:space="preserve">Cộng:</w:t>
+            </w:r>
+          </w:p>
+        </w:tc>
+        <w:tc>
+          <w:p>
+            <w:pPr>
+              <w:jc w:val="center"/>
+            </w:pPr>
+            <w:r>
+              <w:rPr>
+                <w:b/>
+                <w:bCs/>
+              </w:rPr>
+              <w:t xml:space="preserve">12</w:t>
+            </w:r>
+          </w:p>
+        </w:tc>
+        <w:tc>
+          <w:p>
+            <w:pPr>
+              <w:jc w:val="center"/>
+            </w:pPr>
+            <w:r>
+              <w:rPr>
+                <w:b/>
+                <w:bCs/>
+              </w:rPr>
+              <w:t xml:space="preserve">6</w:t>
+            </w:r>
+          </w:p>
+        </w:tc>
+        <w:tc>
+          <w:p>
+            <w:pPr>
+              <w:jc w:val="center"/>
+            </w:pPr>
+            <w:r>
+              <w:rPr>
+                <w:b/>
+                <w:bCs/>
+              </w:rPr>
+              <w:t xml:space="preserve">6</w:t>
+            </w:r>
+          </w:p>
+        </w:tc>
+        <w:tc>
+          <w:p>
+            <w:pPr>
+              <w:jc w:val="center"/>
+            </w:pPr>
+            <w:r>
+              <w:rPr>
+                <w:b/>
+                <w:bCs/>
+              </w:rPr>
+              <w:t xml:space="preserve">0</w:t>
+            </w:r>
+          </w:p>
+        </w:tc>
+      </w:tr>
+    </w:tbl>
+    <w:p>
+      <w:pPr>
+        <w:spacing w:after="200"/>
+      </w:pPr>
+    </w:p>
+    <w:p>
+      <w:pPr>
+        <w:spacing w:after="120"/>
+      </w:pPr>
+      <w:r>
+        <w:rPr>
+          <w:b/>
+          <w:bCs/>
+        </w:rPr>
+        <w:t xml:space="preserve">2. Chương trình chi tiết:</w:t>
+      </w:r>
+    </w:p>
+    <w:p>
+      <w:r>
+        <w:rPr>
+          <w:b/>
+          <w:bCs/>
+        </w:rPr>
         <w:t xml:space="preserve">Bài 1: Khái niệm cơ bản</w:t>
       </w:r>
     </w:p>
     <w:p>
       <w:r>
+        <w:rPr>
+          <w:i/>
+          <w:iCs/>
+        </w:rPr>
+        <w:t xml:space="preserve">Mục tiêu:</w:t>
+      </w:r>
+    </w:p>
+    <w:p>
+      <w:r>
+        <w:t xml:space="preserve">- Phân tích được tầm quan trọng của hệ thống.</w:t>
+      </w:r>
+    </w:p>
+    <w:p>
+      <w:r>
+        <w:t xml:space="preserve">- Trình bày được khái niệm tổng quan về môn học.</w:t>
+      </w:r>
+    </w:p>
+    <w:p>
+      <w:r>
+        <w:t xml:space="preserve">- Thực hiện được các thao tác cơ bản.</w:t>
+      </w:r>
+    </w:p>
+    <w:p>
+      <w:r>
+        <w:rPr>
+          <w:i/>
+          <w:iCs/>
+        </w:rPr>
         <w:t xml:space="preserve">Thời gian: 5 giờ (Lý thuyết: 3 giờ; Thực hành: 2 giờ)</w:t>
       </w:r>
     </w:p>
     <w:p>
       <w:r>
+        <w:rPr>
+          <w:b/>
+          <w:bCs/>
+        </w:rPr>
         <w:t xml:space="preserve">Nội dung:</w:t>
       </w:r>
     </w:p>
@@ -76,25 +459,58 @@
       </w:r>
     </w:p>
     <w:p>
-      <w:r>
-        <w:t xml:space="preserve"> </w:t>
-      </w:r>
-    </w:p>
-    <w:p>
-      <w:pPr>
-        <w:pStyle w:val="Heading4"/>
-      </w:pPr>
-      <w:r>
+      <w:pPr>
+        <w:spacing w:after="120"/>
+      </w:pPr>
+    </w:p>
+    <w:p>
+      <w:r>
+        <w:rPr>
+          <w:b/>
+          <w:bCs/>
+        </w:rPr>
         <w:t xml:space="preserve">Bài 2: Kỹ năng nâng cao</w:t>
       </w:r>
     </w:p>
     <w:p>
       <w:r>
+        <w:rPr>
+          <w:i/>
+          <w:iCs/>
+        </w:rPr>
+        <w:t xml:space="preserve">Mục tiêu:</w:t>
+      </w:r>
+    </w:p>
+    <w:p>
+      <w:r>
+        <w:t xml:space="preserve">- Trình bày được sơ đồ khối hệ thống.</w:t>
+      </w:r>
+    </w:p>
+    <w:p>
+      <w:r>
+        <w:t xml:space="preserve">- Phân tích được các kỹ năng nâng cao.</w:t>
+      </w:r>
+    </w:p>
+    <w:p>
+      <w:r>
+        <w:t xml:space="preserve">- Áp dụng thực hành vào bài tập thực tế.</w:t>
+      </w:r>
+    </w:p>
+    <w:p>
+      <w:r>
+        <w:rPr>
+          <w:i/>
+          <w:iCs/>
+        </w:rPr>
         <w:t xml:space="preserve">Thời gian: 7 giờ (Lý thuyết: 3 giờ; Thực hành: 4 giờ)</w:t>
       </w:r>
     </w:p>
     <w:p>
       <w:r>
+        <w:rPr>
+          <w:b/>
+          <w:bCs/>
+        </w:rPr>
         <w:t xml:space="preserve">Nội dung:</w:t>
       </w:r>
     </w:p>
@@ -115,7 +531,7 @@
     </w:p>
     <w:sectPr>
       <w:pgSz w:w="11906" w:h="16838" w:orient="portrait"/>
-      <w:pgMar w:top="1440" w:right="1440" w:bottom="1440" w:left="1440" w:header="708" w:footer="708" w:gutter="0"/>
+      <w:pgMar w:top="1440" w:right="1134" w:bottom="1440" w:left="1701" w:header="708" w:footer="708" w:gutter="0"/>
       <w:pgNumType/>
       <w:docGrid w:linePitch="360"/>
     </w:sectPr>
@@ -299,8 +715,18 @@
 <file path=word/styles.xml><?xml version="1.0" encoding="utf-8"?>
 <w:styles xmlns:mc="http://schemas.openxmlformats.org/markup-compatibility/2006" xmlns:r="http://schemas.openxmlformats.org/officeDocument/2006/relationships" xmlns:w="http://schemas.openxmlformats.org/wordprocessingml/2006/main" xmlns:w14="http://schemas.microsoft.com/office/word/2010/wordml" xmlns:w15="http://schemas.microsoft.com/office/word/2012/wordml" mc:Ignorable="w14 w15">
   <w:docDefaults>
-    <w:rPrDefault/>
-    <w:pPrDefault/>
+    <w:rPrDefault>
+      <w:rPr>
+        <w:rFonts w:ascii="Times New Roman" w:cs="Times New Roman" w:eastAsia="Times New Roman" w:hAnsi="Times New Roman"/>
+        <w:sz w:val="26"/>
+        <w:szCs w:val="26"/>
+      </w:rPr>
+    </w:rPrDefault>
+    <w:pPrDefault>
+      <w:pPr>
+        <w:spacing w:line="276"/>
+      </w:pPr>
+    </w:pPrDefault>
   </w:docDefaults>
   <w:style w:type="paragraph" w:styleId="Title">
     <w:name w:val="Title"/>

</xml_diff>